<commit_message>
Add AI usage for procedure and report writing
</commit_message>
<xml_diff>
--- a/docs/report.docx
+++ b/docs/report.docx
@@ -103,7 +103,7 @@
       <w:pPr/>
       <w:r>
         <w:rPr/>
-        <w:t>다녀온 맛집의 후기를 남기고 공유하는 게시판입니다. 후기를 찾아보는 사람은 로그인 없이 목록과 상세를 읽을 수 있고, 후기를 쓰려는 사용자는 로그인한 뒤 작성합니다. 글을 쓴 사람만 자기 후기를 수정하거나 삭제할 수 있습니다. 수업 시간에 JWT 로그인을 React와 Express 조합으로 배웠고, 수업 코드(06 JWT 로그인)를 그대로 따라 구현할 수 있어서 이 조합을 선택했습니다. 제공 템플릿에서 바꾼 범위는 서버의 backend-express/src/auth.js(토큰 발급·검증·작성자 검사)와 프론트의 frontend-react/src/api.js, main.jsx의 로그인 연결·토큰 전송·화면 처리이고, 라우트·DB(store.js)·계정(users.js)·검사 프로그램은 제공 코드를 그대로 썼습니다.</w:t>
+        <w:t>다녀온 맛집의 후기를 올리는 게시판입니다. 누구나 글을 읽을 수 있고, 글쓰기는 로그인한 사람만 할 수 있습니다. 수정과 삭제는 글을 쓴 본인만 할 수 있게 했습니다. 수업에서 React와 Express로 JWT 로그인을 배워서 같은 조합으로 만들었습니다. 제가 채운 곳은 서버의 auth.js와 프론트의 api.js, main.jsx이고, 나머지(라우트, DB, 계정, 검사 프로그램)는 제공된 코드를 그대로 썼습니다.</w:t>
       </w:r>
     </w:p>
     <w:tbl>
@@ -1114,7 +1114,7 @@
       </w:pPr>
       <w:r>
         <w:rPr/>
-        <w:t>브라우저 화면(React)은 /api로 요청을 보내고, Vite 프록시가 이를 8000번 Express 서버로 전달합니다. 서버는 로그인 요청에서 JWT를 만들어 돌려주고, 글을 바꾸는 요청에서는 Authorization 헤더의 토큰을 검증한 뒤 SQLite 파일(data/board.sqlite)에 저장합니다. 토큰은 화면의 api.js 변수(메모리)에만 있고 localStorage에는 저장하지 않습니다.</w:t>
+        <w:t>화면(React)이 /api로 요청을 보내면 Vite가 8000번 Express 서버로 넘겨 줍니다. 로그인하면 서버가 JWT를 만들어 주고, 글을 쓰거나 고칠 때는 그 토큰을 헤더에 실어 보냅니다. 토큰은 api.js 변수(메모리)에만 두고 localStorage에는 저장하지 않았습니다.</w:t>
       </w:r>
     </w:p>
     <w:p>
@@ -2470,7 +2470,7 @@
         <w:rPr>
           <w:sz w:val="18"/>
         </w:rPr>
-        <w:t>제공 코드를 그대로 유지한 파일: app.js의 라우트·입력 검사, store.js, users.js, errors.js, style.css, vite.config.js, tools/check_api.py. 추가한 보조 파일: 실행에 필요한 backend-express/.env(비밀 키, Git에는 올리지 않음)와 docs/evidence/(테스트 캡처).</w:t>
+        <w:t>제공 코드를 그대로 유지한 파일: app.js의 라우트·입력 검사, store.js, users.js, errors.js, style.css, vite.config.js, tools/check_api.py. 추가한 보조 파일: 실행에 필요한 backend-express/.env(비밀 키, Git에는 올리지 않음)와 docs/evidence/(테스트 캡처). 어떤 기능을 구현하려면 어느 파일을 고쳐야 하는지는 AI에게 안내받았고, 안내에 따라 제가 해당 파일을 수정했습니다.</w:t>
       </w:r>
     </w:p>
     <w:p>
@@ -2487,7 +2487,7 @@
       </w:pPr>
       <w:r>
         <w:rPr/>
-        <w:t>환경: Windows(빌드 10.0.26300), PowerShell 7.6.9, Node.js v24.21.0, Chrome 156. 작업 폴더 D:\JWT-Assignment에서 backend-express는 npm ci → .env 준비(.env.example을 복사해 JWT_SECRET에 node로 만든 64자리 난수를 넣음, 값은 기록하지 않음) → npm start, frontend-react는 npm ci → npm run build → npm run preview로 실행했습니다. 빌드는 vite v8.3.4에서 '16 modules transformed, built in 536ms'로 성공했고(그림 B01), preview는 http://127.0.0.1:4173에서 열렸습니다(B02). SQLite 파일은 서버를 켤 때 backend-express/data/board.sqlite로 자동 생성되며 Git에는 올라가지 않습니다(.gitignore).</w:t>
+        <w:t>backend-express에서 npm ci, .env 만들기(.env.example을 복사해서 JWT_SECRET에 64자리 난수를 넣음), npm start 순서로 서버를 켰고, frontend-react에서 npm ci, npm run build, npm run preview로 4173번 주소를 열었습니다. 빌드는 에러 없이 끝났습니다(B01). DB 파일(data/board.sqlite)은 서버를 켜면 자동으로 만들어지고 Git에는 올리지 않습니다.</w:t>
       </w:r>
     </w:p>
     <w:p>
@@ -2496,7 +2496,7 @@
       </w:pPr>
       <w:r>
         <w:rPr/>
-        <w:t>4173번 빌드 화면에서 로그인하고 글 목록·상세와 수정·삭제 버튼 표시를 확인했고(B03, B05), 같은 /api 프록시로 8000번 서버에 연결됩니다. 서버를 Ctrl+C로 껐다 켠 뒤에도 Bob이 쓴 글이 그대로 남았습니다(R02→R04, T15). 또한 GitHub에서 새 폴더(D:\clone-test)로 clone해 README의 순서대로 npm ci·.env 준비·빌드·실행했고(N01~N03), 그 폴더에서 검사 프로그램을 돌려 40개 항목이 통과했습니다(N04). 새 DB로 시작해 게시글이 0개였고(N03a) 검사 때 글 번호도 작게 나왔습니다(PUT /posts/3). 첫 시도에서는 예전 폴더의 서버(8000번)가 아직 켜져 있어 예전 글이 보였고, 그 캡처는 새 폴더 증거로 쓸 수 없어 버린 뒤 서버를 모두 끄고 다시 했습니다.</w:t>
+        <w:t>4173번 화면에서 로그인과 글 목록, 수정·삭제 버튼을 확인했습니다(B03, B05). 서버를 껐다 켜도 Bob이 쓴 글이 남아 있었습니다(R02, R04). 마지막으로 GitHub에서 새 폴더(D:\clone-test)에 clone해서 README대로 실행했고(N01~N03), 자동 검사 40개도 통과했습니다(N04). 첫 시도에서는 예전 서버가 켜져 있어서 새 폴더 결과가 아니었기 때문에 그 캡처는 버리고, 서버를 다 끈 다음 다시 했습니다.</w:t>
       </w:r>
     </w:p>
     <w:p>
@@ -2541,6 +2541,16 @@
       </w:r>
       <w:r>
         <w:t>backend-express/src/auth.js 설정부(6~12행)·issueToken(14~23행), backend-express/src/app.js 로그인 라우트(45~60행)</w:t>
+      </w:r>
+    </w:p>
+    <w:p>
+      <w:pPr/>
+      <w:r>
+        <w:rPr>
+          <w:color w:val="5B6772"/>
+          <w:sz w:val="18"/>
+        </w:rPr>
+        <w:t>※ 3절(3.1~3.4)의 설명 글은 AI의 도움을 받아 작성했고, 제 코드와 시험 결과에 맞는지 확인하고 반영했습니다.</w:t>
       </w:r>
     </w:p>
     <w:p>
@@ -3037,7 +3047,7 @@
       </w:pPr>
       <w:r>
         <w:rPr/>
-        <w:t>입력: 이메일과 비밀번호(JSON). 처리: app.js가 입력 형식을 검사하고 users.js의 verifyCredentials로 계정을 확인한 뒤, 맞으면 issueToken(user)을 부릅니다. issueToken은 서버만 아는 키(.env의 JWT_SECRET)로 서명한 HS256 JWT를 만들고, 안에 sub(사용자 id를 문자열로), iss(webservice-class), aud(board-api), exp(지금부터 TOKEN_TTL초, 기본 90초)를 넣습니다. 비밀번호나 해시는 토큰에 넣지 않았습니다(그림 C05에서 payload 확인). 서버는 시작할 때 JWT_SECRET이 64자리 16진수인지 검사해서 비었거나 예시 글자 그대로이면 오류를 내며 켜지지 않습니다(C06). 출력과 실패: 성공 200 {accessToken, expiresIn:90, user}, 계정이 틀리면 401 INVALID_CREDENTIALS(토큰 없음, T03), 입력 형식이 틀리면 400 BAD_INPUT. 처음에는 issueToken이 객체를 돌려줘서 응답에 accessToken이 이중으로 들어가는 문제가 있었고, 문자열만 돌려주도록 고쳤습니다(5절 사례 1).</w:t>
+        <w:t>로그인 요청이 오면 app.js가 이메일과 비밀번호를 확인하고, 맞으면 issueToken으로 토큰을 만듭니다. 토큰은 .env의 JWT_SECRET 키로 서명한 HS256 JWT이고, 안에 사용자 id(sub), iss, aud, 만료 시간(exp, 기본 90초)을 넣었습니다. 비밀번호는 토큰에 넣지 않았습니다(C05). JWT_SECRET이 64자리 16진수가 아니거나 예시 그대로면 서버가 켜지지 않게 했습니다(C06). 성공하면 200과 accessToken, 계정이 틀리면 401 INVALID_CREDENTIALS, 입력이 이상하면 400입니다. 처음 만든 코드는 issueToken이 객체를 돌려줘서 accessToken이 이중으로 들어갔는데, 문자열만 돌려주게 고쳤습니다(5절 사례 1).</w:t>
       </w:r>
     </w:p>
     <w:p>
@@ -3359,7 +3369,7 @@
       </w:pPr>
       <w:r>
         <w:rPr/>
-        <w:t>로그인에 성공하면 login()이 응답의 accessToken과 user를 api.js 안의 session 변수(메모리)에만 저장합니다. localStorage·sessionStorage는 쓰지 않아서 새로고침하면 로그인 상태가 사라집니다(T16). 이후 모든 요청은 authorizationHeaders()가 만든 Authorization: Bearer &lt;토큰&gt; 헤더를 붙여 보내고, 토큰이 없으면 헤더를 아예 보내지 않아 'Bearer undefined'가 나가지 않습니다(F06 헤더 확인, T11에서 로그아웃 후 헤더 없음). 로그아웃 버튼은 clearSession()으로 메모리를 비웁니다. 서버가 401을 돌려주면 request()가 clearSession()을 불러 화면의 로그인 상태도 해제하고, 오류 code(TOKEN_REQUIRED·INVALID_TOKEN·TOKEN_EXPIRED·INVALID_CREDENTIALS)마다 다른 안내 문구를 보여 줍니다(F08, F12, F13). 403은 로그아웃하지 않고 권한 안내만 보여 주며, 204(삭제)는 본문이 없어서 JSON으로 읽지 않습니다(F10에서 삭제 후 오류 없음).</w:t>
+        <w:t>로그인에 성공하면 login()이 토큰과 사용자 정보를 api.js의 session 변수에만 저장합니다. localStorage는 쓰지 않아서 새로고침하면 로그인이 풀립니다(T16). 요청을 보낼 때는 토큰이 있으면 Authorization: Bearer 헤더를 붙이고, 없으면 헤더를 아예 보내지 않습니다(F06, T11c). 서버가 401을 주면 session을 지워서 화면도 로그아웃 상태가 되고, 오류 code마다 다른 안내 문구가 나옵니다(F08, F12, F13). 403일 때는 로그아웃하지 않습니다. 삭제 응답(204)은 본문이 없어서 JSON으로 읽지 않게 했습니다.</w:t>
       </w:r>
     </w:p>
     <w:p>
@@ -3781,7 +3791,7 @@
       </w:pPr>
       <w:r>
         <w:rPr/>
-        <w:t>입력: 요청의 Authorization 헤더. 처리: readBearer가 'Bearer 토큰' 모양에서 토큰만 꺼냅니다(없거나 모양이 다르면 null → 401 TOKEN_REQUIRED). jwt.verify는 서명, 알고리즘(HS256만 허용), iss·aud, 만료(exp)를 한꺼번에 확인합니다. 만료만 걸리면 401 TOKEN_EXPIRED, 서명 변조·알고리즘·iss·aud 오류는 401 INVALID_TOKEN입니다. verify를 통과해도 validClaims로 sub가 양의 정수 문자열인지, exp가 정수인지 한 번 더 확인하고 findPublic으로 실제 있는 사용자인지 확인합니다(아니면 401 INVALID_TOKEN). 출력: 모두 통과하면 사용자 id(숫자)를 돌려주고, app.js의 글 등록·수정·삭제와 /api/me가 이 id만 믿고 씁니다. 401 응답에는 app.js의 오류 처리기가 WWW-Authenticate: Bearer 헤더를 붙입니다(C07). 확인한 결과: 토큰 없음 401 TOKEN_REQUIRED, 서명 첫 글자를 바꾼 토큰 401 INVALID_TOKEN, TOKEN_TTL=3으로 만료시킨 토큰 401 TOKEN_EXPIRED(GET /me·POST·PUT·DELETE 모두, A02).</w:t>
+        <w:t>currentUserId는 요청 헤더에서 토큰을 꺼내 확인하는 함수입니다. 토큰이 없으면 401 TOKEN_REQUIRED입니다. jwt.verify로 서명, HS256, iss, aud, 만료를 확인하고, 만료되면 TOKEN_EXPIRED, 그 밖에 이상하면 INVALID_TOKEN(둘 다 401)입니다. verify를 통과해도 sub와 exp 모양을 한 번 더 보고, 그 사용자가 실제로 있는지도 확인합니다. 다 통과하면 사용자 id를 돌려주고, 글 작성·수정·삭제와 /api/me가 이 id만 사용합니다. 401 응답에는 WWW-Authenticate: Bearer 헤더도 붙습니다(C07). 직접 해 보니 토큰이 없으면 TOKEN_REQUIRED, 서명을 바꾼 토큰은 INVALID_TOKEN이었고, TTL을 3초로 줄여 만료시키면 TOKEN_EXPIRED가 나왔습니다(A02).</w:t>
       </w:r>
     </w:p>
     <w:p>
@@ -4146,7 +4156,7 @@
       </w:pPr>
       <w:r>
         <w:rPr/>
-        <w:t>수정·삭제 라우트는 먼저 currentUserId(req)로 '지금 요청한 사람'의 id를 토큰에서 얻고, getPost로 글을 찾은 다음, assertOwner(userId, p.authorId)로 로그인한 사람의 id와 글쓴이 id를 비교합니다. 다르면 403 FORBIDDEN이고 글은 바뀌지 않습니다(T07·T08, C08의 02·03·04). 401은 '누구인지 확인 못 함(토큰 없음·변조·만료)', 403은 '누구인지는 알지만 권한이 없음'입니다. 처리 순서는 인증 → 글 존재 → 작성자 → 입력 검사라서, Bob이 Alice 글에 공백 제목을 보내면 403, Alice가 자기 글에 같은 입력을 보내면 400 BAD_INPUT이 나옵니다(C08의 05·06). 글을 등록할 때 작성자는 요청 본문이 아니라 토큰에서 얻은 userId로 저장하고, 본문에 authorId·userId를 끼워 넣으면 400 BAD_INPUT입니다(T12). 화면의 canEdit는 로그인 사용자 id와 글쓴이 id가 같을 때만 수정·삭제 버튼을 보여 주는 편의 기능일 뿐이고, 버튼을 숨겨도 서버 검사가 없으면 직접 요청으로 우회되므로 실제 방어는 assertOwner입니다.</w:t>
+        <w:t>수정·삭제 라우트는 먼저 토큰에서 로그인한 사람의 id를 얻고, 글을 찾은 다음, assertOwner로 글쓴이 id와 비교합니다. 다르면 403 FORBIDDEN이고 글은 그대로입니다(T07, T08). 401은 누구인지 모를 때, 403은 누구인지는 알지만 권한이 없을 때입니다. 글을 쓸 때 작성자는 요청 본문이 아니라 토큰의 id로 정하고, 본문에 authorId나 userId를 넣으면 400으로 막습니다(T12). 화면의 canEdit는 내 글일 때만 수정·삭제 버튼을 보여 주는 용도입니다. 버튼을 숨기는 것만으로는 직접 요청을 막을 수 없어서 실제 검사는 서버의 assertOwner가 합니다.</w:t>
       </w:r>
     </w:p>
     <w:p>
@@ -9484,28 +9494,28 @@
       <w:pPr/>
       <w:r>
         <w:rPr/>
-        <w:t>보호 API의 401에는 WWW-Authenticate: Bearer 헤더가 붙었습니다. curl.exe -i로 토큰 없는 GET /api/me·POST /api/posts와 변조 토큰에서 확인했고(C07), 토큰 없는 수정·삭제(C08의 08·10)에서도 나왔으며 크롬 Network의 Response headers에서도 'Www-Authenticate: Bearer'가 보였습니다(T11a).</w:t>
+        <w:t>401 응답에는 WWW-Authenticate: Bearer 헤더가 붙는 것을 확인했습니다. curl.exe -i(C07, C08의 08·10)와 크롬 Network(T11a)에서 봤습니다.</w:t>
       </w:r>
     </w:p>
     <w:p>
       <w:pPr/>
       <w:r>
         <w:rPr/>
-        <w:t>401과 403의 화면 차이: 401(토큰 없음·만료)이 오면 화면이 '로그아웃 상태'로 바뀌고 로그인을 다시 하라는 안내가 나옵니다(F08, F12, F13). 403은 화면에서 남의 글의 수정·삭제 버튼이 숨겨져 있어 직접 만들지 못했고, API로만 확인했습니다(C08, A01). 코드(api.js request)는 401일 때만 로그인 상태를 지우므로 403에서는 로그인이 유지되지만, 이 부분을 화면에서 직접 재현해 보지는 않았습니다.</w:t>
+        <w:t>화면에서 401이 오면 '로그아웃 상태'로 바뀌고 다시 로그인하라는 안내가 나옵니다(F08, F12, F13). 403은 화면에서 남의 글의 수정·삭제 버튼이 안 보여서 직접 만들지 못했고, API로만 확인했습니다(C08, A01). 코드상 401일 때만 로그인 상태를 지우기 때문에 403에서는 로그인이 유지되는 것으로 이해했는데, 화면에서 직접 해 보지는 못했습니다.</w:t>
       </w:r>
     </w:p>
     <w:p>
       <w:pPr/>
       <w:r>
         <w:rPr/>
-        <w:t>실패한 수정·삭제 뒤 공개 조회로 데이터 불변을 확인했습니다. C08의 04는 Bob의 수정(02)·삭제(03)가 403으로 막힌 뒤 GET으로 재조회한 결과 제목 'test post'가 그대로였고, 자동 검사(A01)의 'failed request leaves data unchanged'가 무토큰·Bob·변조 토큰 경우마다 PASS였습니다.</w:t>
+        <w:t>실패한 수정·삭제 뒤에 글이 그대로인지 다시 조회해서 확인했습니다. C08의 04에서 제목 'test post'가 그대로였고, 자동 검사(A01)의 'failed request leaves data unchanged'도 모두 PASS였습니다.</w:t>
       </w:r>
     </w:p>
     <w:p>
       <w:pPr/>
       <w:r>
         <w:rPr/>
-        <w:t>토큰 없이 없는 글을 수정하면 401 / TOKEN_REQUIRED(C08의 10), 정상 토큰으로 같은 없는 글(999999)을 수정하면 404 / NOT_FOUND(C08의 09)였습니다. 인증이 글 존재 확인보다 먼저라는 순서가 그대로 나왔습니다.</w:t>
+        <w:t>토큰 없이 없는 글을 수정하면 401, 정상 토큰으로 없는 글(999999)을 수정하면 404였습니다(C08의 10, 09). 글이 있는지 보기 전에 로그인부터 확인한다는 순서가 맞게 나왔습니다.</w:t>
       </w:r>
     </w:p>
     <w:p>
@@ -11253,7 +11263,7 @@
                 <w:color w:val="5B6772"/>
                 <w:sz w:val="18"/>
               </w:rPr>
-              <w:t>테스트: PowerShell·curl.exe 시험 명령 제안, 오류 원인 진단 명령 제안</w:t>
+              <w:t>구현 절차: 어떤 순서로 구현할지(BE-01, BE-02, BE-03, FE-01~04, 빌드 확인, 보고서) 안내. 각 기능을 구현하려면 어느 파일의 어느 함수를 고쳐야 하는지 안내</w:t>
             </w:r>
           </w:p>
         </w:tc>
@@ -11286,7 +11296,7 @@
                 <w:color w:val="5B6772"/>
                 <w:sz w:val="18"/>
               </w:rPr>
-              <w:t>5절 시험 증거 C03~C08</w:t>
+              <w:t>2절 변경 내역 전체</w:t>
             </w:r>
           </w:p>
         </w:tc>
@@ -11319,7 +11329,555 @@
                 <w:color w:val="5B6772"/>
                 <w:sz w:val="18"/>
               </w:rPr>
-              <w:t>제안 명령을 그대로 실행하고 결과 캡처</w:t>
+              <w:t>안내대로 한 단계씩 수정하고 실행해 확인한 뒤 다음 단계로 진행</w:t>
+            </w:r>
+          </w:p>
+        </w:tc>
+      </w:tr>
+      <w:tr>
+        <w:trPr>
+          <w:cantSplit/>
+        </w:trPr>
+        <w:tc>
+          <w:tcPr>
+            <w:tcW w:type="dxa" w:w="1928"/>
+            <w:vAlign w:val="center"/>
+            <w:shd w:fill="FFFFFF"/>
+            <w:tcBorders>
+              <w:top w:val="single" w:sz="4" w:color="D9D9D9"/>
+              <w:left w:val="single" w:sz="4" w:color="D9D9D9"/>
+              <w:bottom w:val="single" w:sz="4" w:color="D9D9D9"/>
+              <w:right w:val="single" w:sz="4" w:color="D9D9D9"/>
+            </w:tcBorders>
+            <w:tcMar>
+              <w:top w:w="65" w:type="dxa"/>
+              <w:bottom w:w="65" w:type="dxa"/>
+              <w:left w:w="105" w:type="dxa"/>
+              <w:right w:w="105" w:type="dxa"/>
+            </w:tcMar>
+          </w:tcPr>
+          <w:p>
+            <w:pPr>
+              <w:spacing w:before="60" w:after="60" w:line="270" w:lineRule="exact"/>
+            </w:pPr>
+            <w:r>
+              <w:rPr>
+                <w:rFonts w:ascii="Noto Sans CJK KR" w:hAnsi="Noto Sans CJK KR" w:eastAsia="Noto Sans CJK KR"/>
+                <w:b w:val="0"/>
+                <w:color w:val="5B6772"/>
+                <w:sz w:val="18"/>
+              </w:rPr>
+              <w:t>같은 세션</w:t>
+            </w:r>
+          </w:p>
+        </w:tc>
+        <w:tc>
+          <w:tcPr>
+            <w:tcW w:type="dxa" w:w="2098"/>
+            <w:vAlign w:val="center"/>
+            <w:shd w:fill="FFFFFF"/>
+            <w:tcBorders>
+              <w:top w:val="single" w:sz="4" w:color="D9D9D9"/>
+              <w:left w:val="single" w:sz="4" w:color="D9D9D9"/>
+              <w:bottom w:val="single" w:sz="4" w:color="D9D9D9"/>
+              <w:right w:val="single" w:sz="4" w:color="D9D9D9"/>
+            </w:tcBorders>
+            <w:tcMar>
+              <w:top w:w="65" w:type="dxa"/>
+              <w:bottom w:w="65" w:type="dxa"/>
+              <w:left w:w="105" w:type="dxa"/>
+              <w:right w:w="105" w:type="dxa"/>
+            </w:tcMar>
+          </w:tcPr>
+          <w:p>
+            <w:pPr>
+              <w:spacing w:before="60" w:after="60" w:line="270" w:lineRule="exact"/>
+            </w:pPr>
+            <w:r>
+              <w:rPr>
+                <w:rFonts w:ascii="Noto Sans CJK KR" w:hAnsi="Noto Sans CJK KR" w:eastAsia="Noto Sans CJK KR"/>
+                <w:b w:val="0"/>
+                <w:color w:val="5B6772"/>
+                <w:sz w:val="18"/>
+              </w:rPr>
+              <w:t>보고서 작성: 3절 핵심 코드 설명과 2절 변경 내역 표의 초안 작성</w:t>
+            </w:r>
+          </w:p>
+        </w:tc>
+        <w:tc>
+          <w:tcPr>
+            <w:tcW w:type="dxa" w:w="2891"/>
+            <w:vAlign w:val="center"/>
+            <w:shd w:fill="FFFFFF"/>
+            <w:tcBorders>
+              <w:top w:val="single" w:sz="4" w:color="D9D9D9"/>
+              <w:left w:val="single" w:sz="4" w:color="D9D9D9"/>
+              <w:bottom w:val="single" w:sz="4" w:color="D9D9D9"/>
+              <w:right w:val="single" w:sz="4" w:color="D9D9D9"/>
+            </w:tcBorders>
+            <w:tcMar>
+              <w:top w:w="65" w:type="dxa"/>
+              <w:bottom w:w="65" w:type="dxa"/>
+              <w:left w:w="105" w:type="dxa"/>
+              <w:right w:w="105" w:type="dxa"/>
+            </w:tcMar>
+          </w:tcPr>
+          <w:p>
+            <w:pPr>
+              <w:spacing w:before="60" w:after="60" w:line="270" w:lineRule="exact"/>
+            </w:pPr>
+            <w:r>
+              <w:rPr>
+                <w:rFonts w:ascii="Noto Sans CJK KR" w:hAnsi="Noto Sans CJK KR" w:eastAsia="Noto Sans CJK KR"/>
+                <w:b w:val="0"/>
+                <w:color w:val="5B6772"/>
+                <w:sz w:val="18"/>
+              </w:rPr>
+              <w:t>보고서 2절, 3절</w:t>
+            </w:r>
+          </w:p>
+        </w:tc>
+        <w:tc>
+          <w:tcPr>
+            <w:tcW w:type="dxa" w:w="2721"/>
+            <w:vAlign w:val="center"/>
+            <w:shd w:fill="FFFFFF"/>
+            <w:tcBorders>
+              <w:top w:val="single" w:sz="4" w:color="D9D9D9"/>
+              <w:left w:val="single" w:sz="4" w:color="D9D9D9"/>
+              <w:bottom w:val="single" w:sz="4" w:color="D9D9D9"/>
+              <w:right w:val="single" w:sz="4" w:color="D9D9D9"/>
+            </w:tcBorders>
+            <w:tcMar>
+              <w:top w:w="65" w:type="dxa"/>
+              <w:bottom w:w="65" w:type="dxa"/>
+              <w:left w:w="105" w:type="dxa"/>
+              <w:right w:w="105" w:type="dxa"/>
+            </w:tcMar>
+          </w:tcPr>
+          <w:p>
+            <w:pPr>
+              <w:spacing w:before="60" w:after="60" w:line="270" w:lineRule="exact"/>
+            </w:pPr>
+            <w:r>
+              <w:rPr>
+                <w:rFonts w:ascii="Noto Sans CJK KR" w:hAnsi="Noto Sans CJK KR" w:eastAsia="Noto Sans CJK KR"/>
+                <w:b w:val="0"/>
+                <w:color w:val="5B6772"/>
+                <w:sz w:val="18"/>
+              </w:rPr>
+              <w:t>내 코드와 시험 결과에 맞는지 확인하고 일부 문장을 수정</w:t>
+            </w:r>
+          </w:p>
+        </w:tc>
+      </w:tr>
+      <w:tr>
+        <w:trPr>
+          <w:cantSplit/>
+        </w:trPr>
+        <w:tc>
+          <w:tcPr>
+            <w:tcW w:type="dxa" w:w="1928"/>
+            <w:vAlign w:val="center"/>
+            <w:shd w:fill="FFFFFF"/>
+            <w:tcBorders>
+              <w:top w:val="single" w:sz="4" w:color="D9D9D9"/>
+              <w:left w:val="single" w:sz="4" w:color="D9D9D9"/>
+              <w:bottom w:val="single" w:sz="4" w:color="D9D9D9"/>
+              <w:right w:val="single" w:sz="4" w:color="D9D9D9"/>
+            </w:tcBorders>
+            <w:tcMar>
+              <w:top w:w="65" w:type="dxa"/>
+              <w:bottom w:w="65" w:type="dxa"/>
+              <w:left w:w="105" w:type="dxa"/>
+              <w:right w:w="105" w:type="dxa"/>
+            </w:tcMar>
+          </w:tcPr>
+          <w:p>
+            <w:pPr>
+              <w:spacing w:before="60" w:after="60" w:line="270" w:lineRule="exact"/>
+            </w:pPr>
+            <w:r>
+              <w:rPr>
+                <w:rFonts w:ascii="Noto Sans CJK KR" w:hAnsi="Noto Sans CJK KR" w:eastAsia="Noto Sans CJK KR"/>
+                <w:b w:val="0"/>
+                <w:color w:val="5B6772"/>
+                <w:sz w:val="18"/>
+              </w:rPr>
+              <w:t>같은 세션</w:t>
+            </w:r>
+          </w:p>
+        </w:tc>
+        <w:tc>
+          <w:tcPr>
+            <w:tcW w:type="dxa" w:w="2098"/>
+            <w:vAlign w:val="center"/>
+            <w:shd w:fill="FFFFFF"/>
+            <w:tcBorders>
+              <w:top w:val="single" w:sz="4" w:color="D9D9D9"/>
+              <w:left w:val="single" w:sz="4" w:color="D9D9D9"/>
+              <w:bottom w:val="single" w:sz="4" w:color="D9D9D9"/>
+              <w:right w:val="single" w:sz="4" w:color="D9D9D9"/>
+            </w:tcBorders>
+            <w:tcMar>
+              <w:top w:w="65" w:type="dxa"/>
+              <w:bottom w:w="65" w:type="dxa"/>
+              <w:left w:w="105" w:type="dxa"/>
+              <w:right w:w="105" w:type="dxa"/>
+            </w:tcMar>
+          </w:tcPr>
+          <w:p>
+            <w:pPr>
+              <w:spacing w:before="60" w:after="60" w:line="270" w:lineRule="exact"/>
+            </w:pPr>
+            <w:r>
+              <w:rPr>
+                <w:rFonts w:ascii="Noto Sans CJK KR" w:hAnsi="Noto Sans CJK KR" w:eastAsia="Noto Sans CJK KR"/>
+                <w:b w:val="0"/>
+                <w:color w:val="5B6772"/>
+                <w:sz w:val="18"/>
+              </w:rPr>
+              <w:t>학습: 자바스크립트 문법을 모르는 부분마다 하나씩 물어보고 설명을 받음. 웹이 동작하는 기본 원리(요청·응답, 로그인과 토큰)는 수업 PDF 내용을 바탕으로 질문하고 설명을 받음</w:t>
+            </w:r>
+          </w:p>
+        </w:tc>
+        <w:tc>
+          <w:tcPr>
+            <w:tcW w:type="dxa" w:w="2891"/>
+            <w:vAlign w:val="center"/>
+            <w:shd w:fill="FFFFFF"/>
+            <w:tcBorders>
+              <w:top w:val="single" w:sz="4" w:color="D9D9D9"/>
+              <w:left w:val="single" w:sz="4" w:color="D9D9D9"/>
+              <w:bottom w:val="single" w:sz="4" w:color="D9D9D9"/>
+              <w:right w:val="single" w:sz="4" w:color="D9D9D9"/>
+            </w:tcBorders>
+            <w:tcMar>
+              <w:top w:w="65" w:type="dxa"/>
+              <w:bottom w:w="65" w:type="dxa"/>
+              <w:left w:w="105" w:type="dxa"/>
+              <w:right w:w="105" w:type="dxa"/>
+            </w:tcMar>
+          </w:tcPr>
+          <w:p>
+            <w:pPr>
+              <w:spacing w:before="60" w:after="60" w:line="270" w:lineRule="exact"/>
+            </w:pPr>
+            <w:r>
+              <w:rPr>
+                <w:rFonts w:ascii="Noto Sans CJK KR" w:hAnsi="Noto Sans CJK KR" w:eastAsia="Noto Sans CJK KR"/>
+                <w:b w:val="0"/>
+                <w:color w:val="5B6772"/>
+                <w:sz w:val="18"/>
+              </w:rPr>
+              <w:t>auth.js, api.js, main.jsx를 이해하는 과정 전반</w:t>
+            </w:r>
+          </w:p>
+        </w:tc>
+        <w:tc>
+          <w:tcPr>
+            <w:tcW w:type="dxa" w:w="2721"/>
+            <w:vAlign w:val="center"/>
+            <w:shd w:fill="FFFFFF"/>
+            <w:tcBorders>
+              <w:top w:val="single" w:sz="4" w:color="D9D9D9"/>
+              <w:left w:val="single" w:sz="4" w:color="D9D9D9"/>
+              <w:bottom w:val="single" w:sz="4" w:color="D9D9D9"/>
+              <w:right w:val="single" w:sz="4" w:color="D9D9D9"/>
+            </w:tcBorders>
+            <w:tcMar>
+              <w:top w:w="65" w:type="dxa"/>
+              <w:bottom w:w="65" w:type="dxa"/>
+              <w:left w:w="105" w:type="dxa"/>
+              <w:right w:w="105" w:type="dxa"/>
+            </w:tcMar>
+          </w:tcPr>
+          <w:p>
+            <w:pPr>
+              <w:spacing w:before="60" w:after="60" w:line="270" w:lineRule="exact"/>
+            </w:pPr>
+            <w:r>
+              <w:rPr>
+                <w:rFonts w:ascii="Noto Sans CJK KR" w:hAnsi="Noto Sans CJK KR" w:eastAsia="Noto Sans CJK KR"/>
+                <w:b w:val="0"/>
+                <w:color w:val="5B6772"/>
+                <w:sz w:val="18"/>
+              </w:rPr>
+              <w:t>모르는 문법과 원리를 물어서 이해한 뒤 코드에 반영하고 직접 실행해 확인</w:t>
+            </w:r>
+          </w:p>
+        </w:tc>
+      </w:tr>
+      <w:tr>
+        <w:trPr>
+          <w:cantSplit/>
+        </w:trPr>
+        <w:tc>
+          <w:tcPr>
+            <w:tcW w:type="dxa" w:w="1928"/>
+            <w:vAlign w:val="center"/>
+            <w:shd w:fill="FFFFFF"/>
+            <w:tcBorders>
+              <w:top w:val="single" w:sz="4" w:color="D9D9D9"/>
+              <w:left w:val="single" w:sz="4" w:color="D9D9D9"/>
+              <w:bottom w:val="single" w:sz="4" w:color="D9D9D9"/>
+              <w:right w:val="single" w:sz="4" w:color="D9D9D9"/>
+            </w:tcBorders>
+            <w:tcMar>
+              <w:top w:w="65" w:type="dxa"/>
+              <w:bottom w:w="65" w:type="dxa"/>
+              <w:left w:w="105" w:type="dxa"/>
+              <w:right w:w="105" w:type="dxa"/>
+            </w:tcMar>
+          </w:tcPr>
+          <w:p>
+            <w:pPr>
+              <w:spacing w:before="60" w:after="60" w:line="270" w:lineRule="exact"/>
+            </w:pPr>
+            <w:r>
+              <w:rPr>
+                <w:rFonts w:ascii="Noto Sans CJK KR" w:hAnsi="Noto Sans CJK KR" w:eastAsia="Noto Sans CJK KR"/>
+                <w:b w:val="0"/>
+                <w:color w:val="5B6772"/>
+                <w:sz w:val="18"/>
+              </w:rPr>
+              <w:t>같은 세션</w:t>
+            </w:r>
+          </w:p>
+        </w:tc>
+        <w:tc>
+          <w:tcPr>
+            <w:tcW w:type="dxa" w:w="2098"/>
+            <w:vAlign w:val="center"/>
+            <w:shd w:fill="FFFFFF"/>
+            <w:tcBorders>
+              <w:top w:val="single" w:sz="4" w:color="D9D9D9"/>
+              <w:left w:val="single" w:sz="4" w:color="D9D9D9"/>
+              <w:bottom w:val="single" w:sz="4" w:color="D9D9D9"/>
+              <w:right w:val="single" w:sz="4" w:color="D9D9D9"/>
+            </w:tcBorders>
+            <w:tcMar>
+              <w:top w:w="65" w:type="dxa"/>
+              <w:bottom w:w="65" w:type="dxa"/>
+              <w:left w:w="105" w:type="dxa"/>
+              <w:right w:w="105" w:type="dxa"/>
+            </w:tcMar>
+          </w:tcPr>
+          <w:p>
+            <w:pPr>
+              <w:spacing w:before="60" w:after="60" w:line="270" w:lineRule="exact"/>
+            </w:pPr>
+            <w:r>
+              <w:rPr>
+                <w:rFonts w:ascii="Noto Sans CJK KR" w:hAnsi="Noto Sans CJK KR" w:eastAsia="Noto Sans CJK KR"/>
+                <w:b w:val="0"/>
+                <w:color w:val="5B6772"/>
+                <w:sz w:val="18"/>
+              </w:rPr>
+              <w:t>테스트 방법과 명령: Postman 대신 PowerShell(Invoke-RestMethod)과 curl.exe로 API를 시험하는 방법과 문법 안내. 로그인, /me, 토큰 변조, 만료(TTL=3), Alice·Bob 요청 16개, 토큰 payload 확인 명령 제안, 오류 원인 진단 명령</w:t>
+            </w:r>
+          </w:p>
+        </w:tc>
+        <w:tc>
+          <w:tcPr>
+            <w:tcW w:type="dxa" w:w="2891"/>
+            <w:vAlign w:val="center"/>
+            <w:shd w:fill="FFFFFF"/>
+            <w:tcBorders>
+              <w:top w:val="single" w:sz="4" w:color="D9D9D9"/>
+              <w:left w:val="single" w:sz="4" w:color="D9D9D9"/>
+              <w:bottom w:val="single" w:sz="4" w:color="D9D9D9"/>
+              <w:right w:val="single" w:sz="4" w:color="D9D9D9"/>
+            </w:tcBorders>
+            <w:tcMar>
+              <w:top w:w="65" w:type="dxa"/>
+              <w:bottom w:w="65" w:type="dxa"/>
+              <w:left w:w="105" w:type="dxa"/>
+              <w:right w:w="105" w:type="dxa"/>
+            </w:tcMar>
+          </w:tcPr>
+          <w:p>
+            <w:pPr>
+              <w:spacing w:before="60" w:after="60" w:line="270" w:lineRule="exact"/>
+            </w:pPr>
+            <w:r>
+              <w:rPr>
+                <w:rFonts w:ascii="Noto Sans CJK KR" w:hAnsi="Noto Sans CJK KR" w:eastAsia="Noto Sans CJK KR"/>
+                <w:b w:val="0"/>
+                <w:color w:val="5B6772"/>
+                <w:sz w:val="18"/>
+              </w:rPr>
+              <w:t>4절 시험 증거 C03~C08, T11</w:t>
+            </w:r>
+          </w:p>
+        </w:tc>
+        <w:tc>
+          <w:tcPr>
+            <w:tcW w:type="dxa" w:w="2721"/>
+            <w:vAlign w:val="center"/>
+            <w:shd w:fill="FFFFFF"/>
+            <w:tcBorders>
+              <w:top w:val="single" w:sz="4" w:color="D9D9D9"/>
+              <w:left w:val="single" w:sz="4" w:color="D9D9D9"/>
+              <w:bottom w:val="single" w:sz="4" w:color="D9D9D9"/>
+              <w:right w:val="single" w:sz="4" w:color="D9D9D9"/>
+            </w:tcBorders>
+            <w:tcMar>
+              <w:top w:w="65" w:type="dxa"/>
+              <w:bottom w:w="65" w:type="dxa"/>
+              <w:left w:w="105" w:type="dxa"/>
+              <w:right w:w="105" w:type="dxa"/>
+            </w:tcMar>
+          </w:tcPr>
+          <w:p>
+            <w:pPr>
+              <w:spacing w:before="60" w:after="60" w:line="270" w:lineRule="exact"/>
+            </w:pPr>
+            <w:r>
+              <w:rPr>
+                <w:rFonts w:ascii="Noto Sans CJK KR" w:hAnsi="Noto Sans CJK KR" w:eastAsia="Noto Sans CJK KR"/>
+                <w:b w:val="0"/>
+                <w:color w:val="5B6772"/>
+                <w:sz w:val="18"/>
+              </w:rPr>
+              <w:t>제안 명령을 직접 입력·실행하고 결과를 캡처. 결과가 기대와 맞는지 확인</w:t>
+            </w:r>
+          </w:p>
+        </w:tc>
+      </w:tr>
+      <w:tr>
+        <w:trPr>
+          <w:cantSplit/>
+        </w:trPr>
+        <w:tc>
+          <w:tcPr>
+            <w:tcW w:type="dxa" w:w="1928"/>
+            <w:vAlign w:val="center"/>
+            <w:shd w:fill="FFFFFF"/>
+            <w:tcBorders>
+              <w:top w:val="single" w:sz="4" w:color="D9D9D9"/>
+              <w:left w:val="single" w:sz="4" w:color="D9D9D9"/>
+              <w:bottom w:val="single" w:sz="4" w:color="D9D9D9"/>
+              <w:right w:val="single" w:sz="4" w:color="D9D9D9"/>
+            </w:tcBorders>
+            <w:tcMar>
+              <w:top w:w="65" w:type="dxa"/>
+              <w:bottom w:w="65" w:type="dxa"/>
+              <w:left w:w="105" w:type="dxa"/>
+              <w:right w:w="105" w:type="dxa"/>
+            </w:tcMar>
+          </w:tcPr>
+          <w:p>
+            <w:pPr>
+              <w:spacing w:before="60" w:after="60" w:line="270" w:lineRule="exact"/>
+            </w:pPr>
+            <w:r>
+              <w:rPr>
+                <w:rFonts w:ascii="Noto Sans CJK KR" w:hAnsi="Noto Sans CJK KR" w:eastAsia="Noto Sans CJK KR"/>
+                <w:b w:val="0"/>
+                <w:color w:val="5B6772"/>
+                <w:sz w:val="18"/>
+              </w:rPr>
+              <w:t>같은 세션</w:t>
+            </w:r>
+          </w:p>
+        </w:tc>
+        <w:tc>
+          <w:tcPr>
+            <w:tcW w:type="dxa" w:w="2098"/>
+            <w:vAlign w:val="center"/>
+            <w:shd w:fill="FFFFFF"/>
+            <w:tcBorders>
+              <w:top w:val="single" w:sz="4" w:color="D9D9D9"/>
+              <w:left w:val="single" w:sz="4" w:color="D9D9D9"/>
+              <w:bottom w:val="single" w:sz="4" w:color="D9D9D9"/>
+              <w:right w:val="single" w:sz="4" w:color="D9D9D9"/>
+            </w:tcBorders>
+            <w:tcMar>
+              <w:top w:w="65" w:type="dxa"/>
+              <w:bottom w:w="65" w:type="dxa"/>
+              <w:left w:w="105" w:type="dxa"/>
+              <w:right w:w="105" w:type="dxa"/>
+            </w:tcMar>
+          </w:tcPr>
+          <w:p>
+            <w:pPr>
+              <w:spacing w:before="60" w:after="60" w:line="270" w:lineRule="exact"/>
+            </w:pPr>
+            <w:r>
+              <w:rPr>
+                <w:rFonts w:ascii="Noto Sans CJK KR" w:hAnsi="Noto Sans CJK KR" w:eastAsia="Noto Sans CJK KR"/>
+                <w:b w:val="0"/>
+                <w:color w:val="5B6772"/>
+                <w:sz w:val="18"/>
+              </w:rPr>
+              <w:t>Git·GitHub 사용법 안내(commit, push), 새 폴더 clone 재현 절차 안내</w:t>
+            </w:r>
+          </w:p>
+        </w:tc>
+        <w:tc>
+          <w:tcPr>
+            <w:tcW w:type="dxa" w:w="2891"/>
+            <w:vAlign w:val="center"/>
+            <w:shd w:fill="FFFFFF"/>
+            <w:tcBorders>
+              <w:top w:val="single" w:sz="4" w:color="D9D9D9"/>
+              <w:left w:val="single" w:sz="4" w:color="D9D9D9"/>
+              <w:bottom w:val="single" w:sz="4" w:color="D9D9D9"/>
+              <w:right w:val="single" w:sz="4" w:color="D9D9D9"/>
+            </w:tcBorders>
+            <w:tcMar>
+              <w:top w:w="65" w:type="dxa"/>
+              <w:bottom w:w="65" w:type="dxa"/>
+              <w:left w:w="105" w:type="dxa"/>
+              <w:right w:w="105" w:type="dxa"/>
+            </w:tcMar>
+          </w:tcPr>
+          <w:p>
+            <w:pPr>
+              <w:spacing w:before="60" w:after="60" w:line="270" w:lineRule="exact"/>
+            </w:pPr>
+            <w:r>
+              <w:rPr>
+                <w:rFonts w:ascii="Noto Sans CJK KR" w:hAnsi="Noto Sans CJK KR" w:eastAsia="Noto Sans CJK KR"/>
+                <w:b w:val="0"/>
+                <w:color w:val="5B6772"/>
+                <w:sz w:val="18"/>
+              </w:rPr>
+              <w:t>G00~G03, N01~N04</w:t>
+            </w:r>
+          </w:p>
+        </w:tc>
+        <w:tc>
+          <w:tcPr>
+            <w:tcW w:type="dxa" w:w="2721"/>
+            <w:vAlign w:val="center"/>
+            <w:shd w:fill="FFFFFF"/>
+            <w:tcBorders>
+              <w:top w:val="single" w:sz="4" w:color="D9D9D9"/>
+              <w:left w:val="single" w:sz="4" w:color="D9D9D9"/>
+              <w:bottom w:val="single" w:sz="4" w:color="D9D9D9"/>
+              <w:right w:val="single" w:sz="4" w:color="D9D9D9"/>
+            </w:tcBorders>
+            <w:tcMar>
+              <w:top w:w="65" w:type="dxa"/>
+              <w:bottom w:w="65" w:type="dxa"/>
+              <w:left w:w="105" w:type="dxa"/>
+              <w:right w:w="105" w:type="dxa"/>
+            </w:tcMar>
+          </w:tcPr>
+          <w:p>
+            <w:pPr>
+              <w:spacing w:before="60" w:after="60" w:line="270" w:lineRule="exact"/>
+            </w:pPr>
+            <w:r>
+              <w:rPr>
+                <w:rFonts w:ascii="Noto Sans CJK KR" w:hAnsi="Noto Sans CJK KR" w:eastAsia="Noto Sans CJK KR"/>
+                <w:b w:val="0"/>
+                <w:color w:val="5B6772"/>
+                <w:sz w:val="18"/>
+              </w:rPr>
+              <w:t>안내대로 직접 실행하고 캡처</w:t>
             </w:r>
           </w:p>
         </w:tc>
@@ -11479,7 +12037,7 @@
         <w:t xml:space="preserve">도구 / 날짜  </w:t>
       </w:r>
       <w:r>
-        <w:t>Claude / 2026-10-28 (사례 1: BE-01)</w:t>
+        <w:t>Claude / 2026-10-28 (사례 1: BE-01 로그인 토큰 발급)</w:t>
       </w:r>
     </w:p>
     <w:p>
@@ -11491,7 +12049,7 @@
         <w:t xml:space="preserve">요청한 내용  </w:t>
       </w:r>
       <w:r>
-        <w:t>수업 자료(06 JWT 로그인)를 참고해 issueToken을 최대한 간단하고 직관적으로 만들어 달라고 요청</w:t>
+        <w:t>수업 자료(06 JWT 로그인)를 보고 issueToken을 간단하게 만들어 달라고 요청했습니다.</w:t>
       </w:r>
     </w:p>
     <w:p>
@@ -11503,7 +12061,7 @@
         <w:t xml:space="preserve">AI가 제안한 내용  </w:t>
       </w:r>
       <w:r>
-        <w:t>1차 초안은 { accessToken, expiresIn } 객체를 반환하고 iss/aud를 board-api/board-client로 둔 코드. 이후 app.js와 .env.example을 읽고 JWT 문자열만 반환, iss=webservice-class·aud=board-api로 다시 작성</w:t>
+        <w:t>처음 초안은 { accessToken, expiresIn } 객체를 돌려주고 iss/aud 값도 임의로 정한 코드였습니다. 이후 app.js와 .env.example을 보고 JWT 문자열만 돌려주고 iss=webservice-class, aud=board-api로 다시 썼습니다.</w:t>
       </w:r>
     </w:p>
     <w:p>
@@ -11515,7 +12073,7 @@
         <w:t xml:space="preserve">실제 반영 위치  </w:t>
       </w:r>
       <w:r>
-        <w:t>backend-express/src/auth.js issueToken (이 보고서 3.1)</w:t>
+        <w:t>backend-express/src/auth.js issueToken (3.1)</w:t>
       </w:r>
     </w:p>
     <w:p>
@@ -11527,7 +12085,7 @@
         <w:t xml:space="preserve">내가 확인하고 수정한 내용  </w:t>
       </w:r>
       <w:r>
-        <w:t>직접 실행한 로그인 응답에 accessToken이 이중으로 들어간 것을 발견해 AI에게 알렸고, AI 초안의 반환 형태와 iss/aud 값이 제공 파일과 달랐다는 점을 확인한 뒤 정정본으로 교체했습니다.</w:t>
+        <w:t>실행해 보니 로그인 응답에 accessToken이 이중으로 들어가 있어서 AI에게 알렸고, iss/aud 값도 제공 파일과 달라서 고친 코드로 바꿨습니다.</w:t>
       </w:r>
     </w:p>
     <w:p>
@@ -11539,7 +12097,7 @@
         <w:t xml:space="preserve">검증 방법과 결과  </w:t>
       </w:r>
       <w:r>
-        <w:t>T02·T03: 로그인 200에서 accessToken이 문자열(C03), payload의 iss=webservice-class, aud=board-api, sub='1', exp=iat+90(C05), 예시 키로 서버 시작 시 거부(C06)</w:t>
+        <w:t>로그인 200에서 accessToken이 문자열이고(C03), 토큰 안에 iss, aud, sub, exp가 맞게 들어 있는 것을 확인했습니다(C05). 예시 키로는 서버가 켜지지 않았습니다(C06).</w:t>
       </w:r>
     </w:p>
     <w:p>
@@ -11551,7 +12109,7 @@
         <w:t xml:space="preserve">도구 / 날짜: </w:t>
       </w:r>
       <w:r>
-        <w:t>Claude / 2026-10-28 (사례 2: BE-03 작성자 검사 실패와 원인)</w:t>
+        <w:t>Claude / 2026-10-28 (사례 2: BE-03 작성자 검사)</w:t>
       </w:r>
     </w:p>
     <w:p>
@@ -11563,7 +12121,7 @@
         <w:t xml:space="preserve">요청한 내용: </w:t>
       </w:r>
       <w:r>
-        <w:t>assertOwner를 구현하고 C08의 시험 명령(Alice·Bob 요청 16개)을 제안해 달라고 요청</w:t>
+        <w:t>assertOwner를 만들고 Alice·Bob으로 시험할 명령을 제안해 달라고 요청했습니다.</w:t>
       </w:r>
     </w:p>
     <w:p>
@@ -11575,7 +12133,7 @@
         <w:t xml:space="preserve">AI가 제안한 내용: </w:t>
       </w:r>
       <w:r>
-        <w:t>userId !== authorId이면 403 FORBIDDEN을 던지는 코드, 시험 명령, 실패 시 원인을 가르는 진단 명령</w:t>
+        <w:t>userId와 authorId가 다르면 403 FORBIDDEN을 던지는 코드와 시험 명령(요청 16개), 실패했을 때 원인을 찾는 명령이었습니다.</w:t>
       </w:r>
     </w:p>
     <w:p>
@@ -11587,7 +12145,7 @@
         <w:t xml:space="preserve">실제 반영 위치: </w:t>
       </w:r>
       <w:r>
-        <w:t>backend-express/src/auth.js assertOwner (이 보고서 3.4)</w:t>
+        <w:t>backend-express/src/auth.js assertOwner (3.4)</w:t>
       </w:r>
     </w:p>
     <w:p>
@@ -11599,7 +12157,7 @@
         <w:t xml:space="preserve">내가 확인하고 수정한 내용: </w:t>
       </w:r>
       <w:r>
-        <w:t>1차·2차 시험에서 Bob이 Alice 글을 수정(200)하고 삭제(204)했습니다(C08_try1_FAIL, C08_try2_FAIL). 진단하니 auth.js의 마지막 저장 시각이 BE-02 적용 때(12:08:55)로 멈춰 있어서, assertOwner 수정을 파일에 저장하지 않았던 것이 원인이었습니다(_diag). 저장하고 서버를 다시 켰습니다. AI의 진단 명령도 'FORBIDDEN' 글자가 TODO 주석에 있어서 잘못 '있음'으로 나오는 오탐이 있었습니다.</w:t>
+        <w:t>1차, 2차 시험에서 Bob이 Alice 글을 수정하고 삭제할 수 있었습니다(C08_try1, try2). 원인을 찾아보니 제가 assertOwner 수정을 저장하지 않아서 예전 코드가 돌고 있던 것이었습니다(C08_diag). 저장하고 서버를 다시 켰습니다. AI가 준 진단 명령도 주석에 FORBIDDEN이 있어서 잘못 '있음'으로 나오는 문제가 있었습니다.</w:t>
       </w:r>
     </w:p>
     <w:p>
@@ -11611,7 +12169,7 @@
         <w:t xml:space="preserve">검증 방법과 결과: </w:t>
       </w:r>
       <w:r>
-        <w:t>3차 시험(C08)에서 02·03·05가 403 FORBIDDEN, 04 재조회에서 글 그대로, 06은 400. 이후 자동 검사 A01의 'Bob denied PUT/DELETE'도 PASS</w:t>
+        <w:t>3차 시험에서 Bob의 수정·삭제가 403이었고 글은 그대로였습니다(C08). 자동 검사(A01)도 통과했습니다.</w:t>
       </w:r>
     </w:p>
     <w:p>
@@ -11623,7 +12181,7 @@
         <w:t xml:space="preserve">도구 / 날짜: </w:t>
       </w:r>
       <w:r>
-        <w:t>Claude / 2026-10-28 (사례 3: 프론트 FE-01~04와 검증 한계)</w:t>
+        <w:t>Claude / 2026-10-28 (사례 3: 프론트 FE-01~04)</w:t>
       </w:r>
     </w:p>
     <w:p>
@@ -11635,7 +12193,7 @@
         <w:t xml:space="preserve">요청한 내용: </w:t>
       </w:r>
       <w:r>
-        <w:t>api.js와 main.jsx의 로그인 연결·토큰 전송·권한 표시를 수업 방식으로 간단하게 만들어 달라고 요청</w:t>
+        <w:t>api.js와 main.jsx에서 로그인 연결, 토큰 전송, 권한 표시를 수업 방식으로 간단하게 만들어 달라고 요청했습니다.</w:t>
       </w:r>
     </w:p>
     <w:p>
@@ -11647,7 +12205,7 @@
         <w:t xml:space="preserve">AI가 제안한 내용: </w:t>
       </w:r>
       <w:r>
-        <w:t>login, authorizationHeaders, 401 처리, canEdit와 안내 문구 코드. AI 쪽에서는 npm 설치가 막혀 브라우저로 실행하지 못하고 문법 검사와 가짜 서버 시험까지만 했다고 밝혔습니다.</w:t>
+        <w:t>login, 헤더 만들기, 401 처리, canEdit와 안내 문구 코드입니다. AI 쪽에서는 npm 설치가 안 돼서 브라우저로 실행해 보지 못했다고 했습니다.</w:t>
       </w:r>
     </w:p>
     <w:p>
@@ -11659,7 +12217,7 @@
         <w:t xml:space="preserve">실제 반영 위치: </w:t>
       </w:r>
       <w:r>
-        <w:t>frontend-react/src/api.js, main.jsx (이 보고서 3.2)</w:t>
+        <w:t>frontend-react/src/api.js, main.jsx (3.2)</w:t>
       </w:r>
     </w:p>
     <w:p>
@@ -11671,7 +12229,7 @@
         <w:t xml:space="preserve">내가 확인하고 수정한 내용: </w:t>
       </w:r>
       <w:r>
-        <w:t>코드를 붙여넣고 크롬에서 직접 시험했습니다. 처음 Network에서 Authorization 헤더가 안 보여 당황했지만, 토큰이 90초 만료로 이미 지워진 뒤 눌러서 헤더를 안 보낸 것이었고 로그인 직후에 다시 하니 헤더가 보였습니다(F06). 파일 카드가 안 열려 코드를 채팅에서 복사해 붙여넣기도 했습니다.</w:t>
+        <w:t>코드를 붙여넣고 크롬에서 직접 시험했습니다. 처음에는 Network에 Authorization 헤더가 안 보였는데, 90초가 지나 로그인이 풀린 뒤에 눌러서 그랬던 것이었고, 로그인 직후에 다시 하니 헤더가 보였습니다(F06). 파일 카드가 안 열려서 코드를 채팅으로 받아 붙여넣기도 했습니다.</w:t>
       </w:r>
     </w:p>
     <w:p>
@@ -11683,7 +12241,7 @@
         <w:t xml:space="preserve">검증 방법과 결과: </w:t>
       </w:r>
       <w:r>
-        <w:t>F01~F13: 로그인·버튼 표시·글 작성·수정·삭제·만료 안내·새로고침, 4173 빌드 화면 B03·B05</w:t>
+        <w:t>F01~F13에서 로그인, 버튼 표시, 글 작성·수정·삭제, 만료 안내, 새로고침을 확인했고 4173 빌드 화면도 확인했습니다(B03, B05).</w:t>
       </w:r>
     </w:p>
     <w:p>
@@ -12160,7 +12718,7 @@
       </w:pPr>
       <w:r>
         <w:rPr/>
-        <w:t>요청 본문의 authorId를 믿으면 Bob이 {"authorId":1}을 끼워 넣어 Alice 이름으로 글을 쓸 수 있습니다. 제 코드는 작성자를 본문에서 받지 않고 토큰에서 얻은 userId로 저장하고, 본문에 authorId·userId 같은 허용 안 된 필드가 있으면 400 BAD_INPUT으로 막습니다(C08의 11, A01의 reject authorId·userId).</w:t>
+        <w:t>본문의 authorId를 믿으면 Bob이 authorId:1을 넣어서 Alice 이름으로 글을 쓸 수 있습니다. 그래서 작성자는 본문이 아니라 토큰에서 얻은 id로 저장하고, 본문에 authorId나 userId가 있으면 400으로 막았습니다(C08의 11, A01).</w:t>
       </w:r>
     </w:p>
     <w:p>
@@ -12177,7 +12735,7 @@
       </w:pPr>
       <w:r>
         <w:rPr/>
-        <w:t>버튼을 숨기는 건 화면에서만 막는 것이라서, 개발자도구나 curl로 서버에 직접 PUT·DELETE를 보내면 우회됩니다. 그래서 서버의 assertOwner(userId, p.authorId)가 로그인한 사람과 글쓴이를 비교해 다르면 403으로 막습니다. 화면에서 버튼을 숨겨도 Bob 토큰으로 직접 요청했을 때 403이 나오는 것을 확인했습니다(C08, A01).</w:t>
+        <w:t>버튼을 숨기는 건 화면에서만 막는 거라서, 개발자도구나 curl로 서버에 직접 요청하면 뚫립니다. 그래서 서버의 assertOwner가 로그인한 사람과 글쓴이를 비교해서 다르면 403을 줍니다. Bob 토큰으로 직접 요청해서 403이 나오는 걸 확인했습니다(C08, A01).</w:t>
       </w:r>
     </w:p>
     <w:p>
@@ -12194,7 +12752,7 @@
       </w:pPr>
       <w:r>
         <w:rPr/>
-        <w:t>decode는 토큰 안의 글자를 읽기만 해서 위조된 토큰도 그대로 읽힙니다. verify는 서버의 비밀 키로 서명을 다시 계산해 맞는지 확인하고 만료까지 검사합니다. 제 코드는 jwt.verify로 서명·HS256 알고리즘·iss·aud·exp를 확인하고, 이어서 sub가 양의 정수 문자열인지, exp가 정수인지, 그 사용자가 실제로 있는지까지 확인합니다.</w:t>
+        <w:t>decode는 토큰 안의 내용을 읽기만 해서, 위조된 토큰도 그냥 읽힙니다. verify는 서버의 비밀 키로 서명이 맞는지, 만료되지 않았는지까지 확인합니다. 제 코드는 jwt.verify로 서명, HS256, iss, aud, exp를 확인하고, 그 뒤에 sub 모양과 실제 사용자인지도 봅니다.</w:t>
       </w:r>
     </w:p>
     <w:p>
@@ -12211,7 +12769,7 @@
       </w:pPr>
       <w:r>
         <w:rPr/>
-        <w:t>로그아웃은 메모리의 토큰과 사용자 정보를 지워서 다음 요청부터 Authorization 헤더가 빠집니다(T11). 토큰 만료는 서버가 401 TOKEN_EXPIRED를 주고 화면이 로그인 상태를 지웁니다(T10). 새로고침은 메모리가 사라져 로그인 상태가 해제됩니다(T16). 이미 복사된 토큰은 로그아웃해도 서버가 따로 막지 않아서 만료 시간(90초)이 지나기 전까지는 유효합니다. 그래서 TTL을 짧게 둡니다.</w:t>
+        <w:t>로그아웃은 메모리에 있는 토큰을 지워서 다음 요청부터 헤더가 빠집니다(T11). 만료되면 서버가 401 TOKEN_EXPIRED를 주고 화면이 로그인 상태를 지웁니다(T10). 새로고침하면 메모리가 날아가서 로그인이 풀립니다(T16). 이미 복사해 둔 토큰은 로그아웃해도 서버가 막지 않아서 만료(90초)까지는 쓸 수 있습니다. 그래서 만료 시간을 짧게 둡니다.</w:t>
       </w:r>
     </w:p>
     <w:p>
@@ -12228,7 +12786,7 @@
       </w:pPr>
       <w:r>
         <w:rPr/>
-        <w:t>가장 어려웠던 것은 BE-03을 만든 뒤 Bob이 Alice 글을 수정·삭제할 수 있었던 1·2차 실패였습니다. 처음에는 코드가 틀렸나 서버가 안 켜졌나 헷갈렸는데, 진단해 보니 auth.js를 저장하지 않아서 예전 코드가 계속 돌고 있었습니다. 저장하고 서버를 다시 켠 뒤 같은 16개 요청을 다시 보내 02·03·05가 403으로 바뀐 것을 확인했습니다(C08 3차). 그 뒤로는 파일 저장 표시(●)와 서버 재시작을 먼저 확인합니다.</w:t>
+        <w:t>BE-03을 만들었는데 Bob이 Alice 글을 수정·삭제할 수 있었던 일이 제일 어려웠습니다(1·2차 실패). 코드가 틀린 줄 알았는데 확인해 보니 auth.js를 저장하지 않아서 예전 코드가 돌고 있었습니다. 저장하고 서버를 다시 켜서 같은 16개 요청을 보내니 403이 나왔습니다(C08 3차). 그 뒤로는 파일이 저장됐는지와 서버를 다시 켰는지부터 확인하려고 합니다.</w:t>
       </w:r>
     </w:p>
     <w:p>
@@ -12242,7 +12800,7 @@
         <w:t xml:space="preserve">현재 남은 문제와 다음에 개선할 점  </w:t>
       </w:r>
       <w:r>
-        <w:t>복사된 토큰은 만료 전까지 유효하다(서버에서 폐기하지 않음). HTTPS 없이 로컬 http로만 시험했다. 로그인 시도 횟수 제한은 없다. 화면에서 403이 나오는 모습은 직접 재현하지 못하고 API로만 확인했다. 제목 변경 전에 찍은 캡처는 화면 제목이 '우리의 기록'이다.</w:t>
+        <w:t>복사한 토큰은 만료되기 전까지 쓸 수 있습니다. HTTPS 없이 로컬 http로만 시험했습니다. 로그인 시도 횟수 제한은 없습니다. 화면에서 403이 나오는 모습은 직접 못 해 봤습니다. 제목을 바꾸기 전에 찍은 캡처는 화면 제목이 '우리의 기록'입니다.</w:t>
       </w:r>
     </w:p>
     <w:p>

</xml_diff>